<commit_message>
Simplify SDLE 14 wording
Co-Authored-By: Claude Fable 5.1 <noreply@anthropic.com>
Claude-Session: https://claude.ai/code/session_01AtNfAwt6xzewp5rtAhSSB2
</commit_message>
<xml_diff>
--- a/SDLE/SDLE_Churn_Rate.docx
+++ b/SDLE/SDLE_Churn_Rate.docx
@@ -246,7 +246,7 @@
                 <w:sz w:val="20"/>
                 <w:szCs w:val="20"/>
               </w:rPr>
-              <w:t xml:space="preserve">Churn rate is the percentage of customers who cancel or stop buying from you in a set amount of time, usually a month. If you start the month with 1,000 subscribers and 20 cancel, your churn is 2%. It matters because it costs a lot more to win a new customer than to keep one you already have, so even a small drop in churn can make a big difference in profit.</w:t>
+              <w:t xml:space="preserve">Churn rate is the percent of customers who leave in a month. If you have 1,000 subscribers and 20 cancel, that is 2% churn. It matters because it costs way more to get a new customer than to keep one.</w:t>
             </w:r>
           </w:p>
         </w:tc>
@@ -282,7 +282,7 @@
                 <w:sz w:val="20"/>
                 <w:szCs w:val="20"/>
               </w:rPr>
-              <w:t xml:space="preserve">Netflix has the lowest churn of any major streaming service, around 2% a month, while most competitors are closer to 4 to 7%. They do it by tracking what people watch and pause, recommending shows that fit, and reaching out to people whose viewing drops off before they cancel.</w:t>
+              <w:t xml:space="preserve">Netflix has the lowest churn in streaming, about 2% a month. Most other services are around 4 to 7%. Netflix keeps it low by watching what people view and pushing new shows to anyone who has stopped logging in.</w:t>
             </w:r>
           </w:p>
         </w:tc>
@@ -422,7 +422,7 @@
         <w:rPr>
           <w:rFonts w:ascii="Times New Roman" w:eastAsia="Times New Roman" w:hAnsi="Times New Roman" w:cs="Times New Roman"/>
         </w:rPr>
-        <w:t xml:space="preserve">I picked churn rate because it is a simple number that explains a lot. Churn is just the percentage of customers who leave in a given month. If you start with 1,000 subscribers and 20 cancel, that is 2% churn. What I did not realize is how much that number controls everything else. The chapter says it costs five to seven times more to get a new customer than to keep one, so a company that is leaking customers has to spend a ton on marketing just to stay in the same place.</w:t>
+        <w:t xml:space="preserve">I picked churn rate because it is a simple number that says a lot. Churn is the percent of customers who leave in a month. If you have 1,000 subscribers and 20 cancel, that is 2% churn. The part I did not know is how much that one number matters. The chapter says it costs five to seven times more to get a new customer than to keep one. So if a company keeps losing customers, it has to spend a ton on ads just to stay even.</w:t>
       </w:r>
     </w:p>
     <w:p>
@@ -438,7 +438,7 @@
         <w:rPr>
           <w:rFonts w:ascii="Times New Roman" w:eastAsia="Times New Roman" w:hAnsi="Times New Roman" w:cs="Times New Roman"/>
         </w:rPr>
-        <w:t xml:space="preserve">Netflix is the example that made it click for me. Their churn is around 2% a month, which is about the lowest in streaming. Most of their competitors are somewhere between 4 and 7%. That gap sounds small but it adds up fast when you have 280 million subscribers. The way they keep it low is by using the data they already have. They track what people watch, what they pause, and how often they log in. If someone has not opened the app in a couple of weeks, that is a warning sign, and they will push a show they think that person will like before they get around to cancelling. That is what the chapter calls analytical CRM, and Netflix basically built their business on it.</w:t>
+        <w:t xml:space="preserve">Netflix is the example that made it make sense to me. Their churn is about 2% a month, which is the lowest in streaming. Most other services are between 4 and 7%. That sounds like a small gap, but with 280 million subscribers it is huge. Netflix keeps churn low by using data they already have. They know what you watch, what you stop halfway through, and how often you log in. If you have not opened the app in two weeks, that is a red flag. They will push a show they think you will like before you think about cancelling. The chapter calls this analytical CRM, and Netflix basically runs on it.</w:t>
       </w:r>
     </w:p>
     <w:p>
@@ -454,7 +454,7 @@
         <w:rPr>
           <w:rFonts w:ascii="Times New Roman" w:eastAsia="Times New Roman" w:hAnsi="Times New Roman" w:cs="Times New Roman"/>
         </w:rPr>
-        <w:t xml:space="preserve">What I take from this is that keeping customers is more of a data problem than a sales problem. Netflix does not call people and beg them to stay. They just pay attention to behavior and act on it early. I think a lot of smaller companies could do a version of that with the CRM tools they already pay for, but most of them only look at churn after people are already gone.</w:t>
+        <w:t xml:space="preserve">The main thing I took away is that keeping customers is a data problem more than a sales problem. Netflix does not call people and ask them to stay. They just watch what people do and act early. I think smaller companies could do the same thing with the CRM tools they already have, but most only look at churn after the customer is already gone.</w:t>
       </w:r>
     </w:p>
     <w:sectPr>

</xml_diff>